<commit_message>
cleaning curated_database of redundant seqs
</commit_message>
<xml_diff>
--- a/docs/mining_artic_phages.docx
+++ b/docs/mining_artic_phages.docx
@@ -3,37 +3,445 @@
 <w:document xmlns:wpc="http://schemas.microsoft.com/office/word/2010/wordprocessingCanvas" xmlns:cx="http://schemas.microsoft.com/office/drawing/2014/chartex" xmlns:cx1="http://schemas.microsoft.com/office/drawing/2015/9/8/chartex" xmlns:cx2="http://schemas.microsoft.com/office/drawing/2015/10/21/chartex" xmlns:cx3="http://schemas.microsoft.com/office/drawing/2016/5/9/chartex" xmlns:cx4="http://schemas.microsoft.com/office/drawing/2016/5/10/chartex" xmlns:cx5="http://schemas.microsoft.com/office/drawing/2016/5/11/chartex" xmlns:cx6="http://schemas.microsoft.com/office/drawing/2016/5/12/chartex" xmlns:cx7="http://schemas.microsoft.com/office/drawing/2016/5/13/chartex" xmlns:cx8="http://schemas.microsoft.com/office/drawing/2016/5/14/chartex" xmlns:mc="http://schemas.openxmlformats.org/markup-compatibility/2006" xmlns:aink="http://schemas.microsoft.com/office/drawing/2016/ink" xmlns:am3d="http://schemas.microsoft.com/office/drawing/2017/model3d" xmlns:o="urn:schemas-microsoft-com:office:office" xmlns:oel="http://schemas.microsoft.com/office/2019/extlst" xmlns:r="http://schemas.openxmlformats.org/officeDocument/2006/relationships" xmlns:m="http://schemas.openxmlformats.org/officeDocument/2006/math" xmlns:v="urn:schemas-microsoft-com:vml" xmlns:wp14="http://schemas.microsoft.com/office/word/2010/wordprocessingDrawing" xmlns:wp="http://schemas.openxmlformats.org/drawingml/2006/wordprocessingDrawing" xmlns:w10="urn:schemas-microsoft-com:office:word" xmlns:w="http://schemas.openxmlformats.org/wordprocessingml/2006/main" xmlns:w14="http://schemas.microsoft.com/office/word/2010/wordml" xmlns:w15="http://schemas.microsoft.com/office/word/2012/wordml" xmlns:w16cex="http://schemas.microsoft.com/office/word/2018/wordml/cex" xmlns:w16cid="http://schemas.microsoft.com/office/word/2016/wordml/cid" xmlns:w16="http://schemas.microsoft.com/office/word/2018/wordml" xmlns:w16du="http://schemas.microsoft.com/office/word/2023/wordml/word16du" xmlns:w16sdtdh="http://schemas.microsoft.com/office/word/2020/wordml/sdtdatahash" xmlns:w16sdtfl="http://schemas.microsoft.com/office/word/2024/wordml/sdtformatlock" xmlns:w16se="http://schemas.microsoft.com/office/word/2015/wordml/symex" xmlns:wpg="http://schemas.microsoft.com/office/word/2010/wordprocessingGroup" xmlns:wpi="http://schemas.microsoft.com/office/word/2010/wordprocessingInk" xmlns:wne="http://schemas.microsoft.com/office/word/2006/wordml" xmlns:wps="http://schemas.microsoft.com/office/word/2010/wordprocessingShape" mc:Ignorable="w14 w15 w16se w16cid w16 w16cex w16sdtdh w16sdtfl w16du wp14">
   <w:body>
     <w:p>
-      <w:r>
+      <w:pPr>
+        <w:rPr>
+          <w:sz w:val="48"/>
+          <w:szCs w:val="48"/>
+        </w:rPr>
+      </w:pPr>
+      <w:r>
+        <w:rPr>
+          <w:sz w:val="48"/>
+          <w:szCs w:val="48"/>
+        </w:rPr>
         <w:t>BACKGROUND</w:t>
       </w:r>
     </w:p>
     <w:p>
-      <w:r>
-        <w:t xml:space="preserve">Market importance of cold adapted enzymes </w:t>
-      </w:r>
-      <w:r>
-        <w:t>https://link.springer.com/article/10.1007/s00449-023-02904-2</w:t>
+      <w:pPr>
+        <w:rPr>
+          <w:sz w:val="48"/>
+          <w:szCs w:val="48"/>
+        </w:rPr>
+      </w:pPr>
+    </w:p>
+    <w:p>
+      <w:r>
+        <w:rPr>
+          <w:sz w:val="36"/>
+          <w:szCs w:val="36"/>
+        </w:rPr>
+        <w:t>Market importance of cold adapted enzymes</w:t>
+      </w:r>
+      <w:r>
+        <w:t xml:space="preserve"> </w:t>
+      </w:r>
+      <w:hyperlink r:id="rId5" w:history="1">
+        <w:r>
+          <w:rPr>
+            <w:rStyle w:val="Hyperlink"/>
+          </w:rPr>
+          <w:t>https://link.springer.com/article/10.1007/s00449-023-02904-2</w:t>
+        </w:r>
+      </w:hyperlink>
+    </w:p>
+    <w:p>
+      <w:hyperlink r:id="rId6" w:history="1">
+        <w:r>
+          <w:rPr>
+            <w:rStyle w:val="Hyperlink"/>
+          </w:rPr>
+          <w:t>https://www.sciencedirect.com/topics/biochemistry-genetics-and-molecular-biology/nucleic-acid-amplification</w:t>
+        </w:r>
+      </w:hyperlink>
+      <w:r>
+        <w:t xml:space="preserve"> - focuses on isothermal (don’t require hating)</w:t>
       </w:r>
     </w:p>
     <w:p/>
     <w:p/>
     <w:p>
-      <w:r>
+      <w:pPr>
+        <w:rPr>
+          <w:sz w:val="36"/>
+          <w:szCs w:val="36"/>
+        </w:rPr>
+      </w:pPr>
+      <w:r>
+        <w:rPr>
+          <w:sz w:val="36"/>
+          <w:szCs w:val="36"/>
+        </w:rPr>
         <w:t>RPA</w:t>
       </w:r>
     </w:p>
+    <w:p>
+      <w:r>
+        <w:t>Recombinase Polymerase Amplification</w:t>
+      </w:r>
+    </w:p>
+    <w:p>
+      <w:proofErr w:type="spellStart"/>
+      <w:r>
+        <w:t>UvsX</w:t>
+      </w:r>
+      <w:proofErr w:type="spellEnd"/>
+      <w:r>
+        <w:t xml:space="preserve"> is a recombinase. Related to the </w:t>
+      </w:r>
+      <w:proofErr w:type="spellStart"/>
+      <w:r>
+        <w:t>RecA</w:t>
+      </w:r>
+      <w:proofErr w:type="spellEnd"/>
+      <w:r>
+        <w:t xml:space="preserve"> family found in bacteria.</w:t>
+      </w:r>
+    </w:p>
+    <w:p>
+      <w:r>
+        <w:t xml:space="preserve">It plays a role in DNA repair. Recombinases bind non-specifically to ssDNA. Forming a complex. This complex then finds a section of DNA in the genome that matches the primers ssDNA and in the </w:t>
+      </w:r>
+      <w:proofErr w:type="spellStart"/>
+      <w:r>
+        <w:t>prescence</w:t>
+      </w:r>
+      <w:proofErr w:type="spellEnd"/>
+      <w:r>
+        <w:t xml:space="preserve"> of ATP </w:t>
+      </w:r>
+      <w:r>
+        <w:t xml:space="preserve">forces the strand open and invades. The recombinases </w:t>
+      </w:r>
+      <w:proofErr w:type="spellStart"/>
+      <w:r>
+        <w:t>deattach</w:t>
+      </w:r>
+      <w:proofErr w:type="spellEnd"/>
+      <w:r>
+        <w:t xml:space="preserve">. DNA stabilising proteins stabilise the </w:t>
+      </w:r>
+      <w:proofErr w:type="spellStart"/>
+      <w:r>
+        <w:t>deattached</w:t>
+      </w:r>
+      <w:proofErr w:type="spellEnd"/>
+      <w:r>
+        <w:t xml:space="preserve"> strand and a polymerase extends DNA from the 3’ end.</w:t>
+      </w:r>
+    </w:p>
     <w:p/>
     <w:p>
-      <w:r>
+      <w:pPr>
+        <w:rPr>
+          <w:sz w:val="36"/>
+          <w:szCs w:val="36"/>
+        </w:rPr>
+      </w:pPr>
+      <w:r>
+        <w:rPr>
+          <w:sz w:val="36"/>
+          <w:szCs w:val="36"/>
+        </w:rPr>
         <w:t>Cold Enzyme adaptations</w:t>
       </w:r>
     </w:p>
+    <w:p>
+      <w:r>
+        <w:t>what is enthalpy and entropy in this context</w:t>
+      </w:r>
+    </w:p>
     <w:p/>
-    <w:p>
-      <w:r>
-        <w:t>Computational methods to discover LSRs</w:t>
-      </w:r>
-    </w:p>
+    <w:p/>
+    <w:p/>
+    <w:p/>
+    <w:p>
+      <w:pPr>
+        <w:rPr>
+          <w:sz w:val="36"/>
+          <w:szCs w:val="36"/>
+        </w:rPr>
+      </w:pPr>
+      <w:r>
+        <w:rPr>
+          <w:sz w:val="36"/>
+          <w:szCs w:val="36"/>
+        </w:rPr>
+        <w:t>Classification of thermal ranges</w:t>
+      </w:r>
+    </w:p>
+    <w:p>
+      <w:r>
+        <w:t xml:space="preserve">Yang et al paper on comparison between </w:t>
+      </w:r>
+      <w:proofErr w:type="spellStart"/>
+      <w:r>
+        <w:t>UvsX</w:t>
+      </w:r>
+      <w:proofErr w:type="spellEnd"/>
+      <w:r>
+        <w:t xml:space="preserve"> and </w:t>
+      </w:r>
+      <w:proofErr w:type="spellStart"/>
+      <w:r>
+        <w:t>RecA</w:t>
+      </w:r>
+      <w:proofErr w:type="spellEnd"/>
+      <w:r>
+        <w:t xml:space="preserve"> have a section on how they simulated effects of temp on protein stability. Will be useful for classifying thermal ranges of candidates identified.</w:t>
+      </w:r>
+    </w:p>
+    <w:p>
+      <w:r>
+        <w:t>Molecular dynamics can also be used to classify thermal ranges</w:t>
+      </w:r>
+    </w:p>
+    <w:p/>
+    <w:p/>
+    <w:p>
+      <w:r>
+        <w:t xml:space="preserve">Obtaining the reference protein </w:t>
+      </w:r>
+      <w:proofErr w:type="spellStart"/>
+      <w:r>
+        <w:t>seqs</w:t>
+      </w:r>
+      <w:proofErr w:type="spellEnd"/>
+      <w:r>
+        <w:t xml:space="preserve"> for </w:t>
+      </w:r>
+      <w:proofErr w:type="spellStart"/>
+      <w:r>
+        <w:t>UvsX</w:t>
+      </w:r>
+      <w:proofErr w:type="spellEnd"/>
+    </w:p>
+    <w:p>
+      <w:pPr>
+        <w:pStyle w:val="ListParagraph"/>
+        <w:numPr>
+          <w:ilvl w:val="0"/>
+          <w:numId w:val="1"/>
+        </w:numPr>
+      </w:pPr>
+      <w:r>
+        <w:t xml:space="preserve">Querying databases for </w:t>
+      </w:r>
+      <w:proofErr w:type="spellStart"/>
+      <w:r>
+        <w:t>Phages</w:t>
+      </w:r>
+      <w:proofErr w:type="spellEnd"/>
+      <w:r>
+        <w:t xml:space="preserve"> with a </w:t>
+      </w:r>
+      <w:proofErr w:type="spellStart"/>
+      <w:r>
+        <w:t>UvsX</w:t>
+      </w:r>
+      <w:proofErr w:type="spellEnd"/>
+      <w:r>
+        <w:t xml:space="preserve">-like protein. This will allow us to train </w:t>
+      </w:r>
+      <w:proofErr w:type="gramStart"/>
+      <w:r>
+        <w:t>a</w:t>
+      </w:r>
+      <w:proofErr w:type="gramEnd"/>
+      <w:r>
+        <w:t xml:space="preserve"> HMM to predict novel </w:t>
+      </w:r>
+      <w:proofErr w:type="spellStart"/>
+      <w:r>
+        <w:t>UvsX</w:t>
+      </w:r>
+      <w:proofErr w:type="spellEnd"/>
+      <w:r>
+        <w:t>-like proteins not annotated before.</w:t>
+      </w:r>
+    </w:p>
+    <w:p>
+      <w:pPr>
+        <w:pStyle w:val="ListParagraph"/>
+        <w:numPr>
+          <w:ilvl w:val="0"/>
+          <w:numId w:val="1"/>
+        </w:numPr>
+      </w:pPr>
+      <w:r>
+        <w:t>HMM will be trained on the alignments of all UVSX-like proteins</w:t>
+      </w:r>
+    </w:p>
+    <w:p/>
+    <w:p/>
+    <w:p/>
+    <w:p>
+      <w:r>
+        <w:t>Methodology</w:t>
+      </w:r>
+    </w:p>
+    <w:p>
+      <w:r>
+        <w:t xml:space="preserve">NCBI virus database queried via </w:t>
+      </w:r>
+      <w:proofErr w:type="spellStart"/>
+      <w:r>
+        <w:t>api</w:t>
+      </w:r>
+      <w:proofErr w:type="spellEnd"/>
+      <w:r>
+        <w:t xml:space="preserve"> for search terms. </w:t>
+      </w:r>
+      <w:proofErr w:type="spellStart"/>
+      <w:r>
+        <w:t>Uvsx</w:t>
+      </w:r>
+      <w:proofErr w:type="spellEnd"/>
+      <w:r>
+        <w:t xml:space="preserve"> or </w:t>
+      </w:r>
+      <w:proofErr w:type="spellStart"/>
+      <w:r>
+        <w:t>RecA</w:t>
+      </w:r>
+      <w:proofErr w:type="spellEnd"/>
+      <w:r>
+        <w:t xml:space="preserve"> for viruses. All sequences downloaded </w:t>
+      </w:r>
+      <w:proofErr w:type="spellStart"/>
+      <w:r>
+        <w:t>aswell</w:t>
+      </w:r>
+      <w:proofErr w:type="spellEnd"/>
+      <w:r>
+        <w:t xml:space="preserve"> as metadata.</w:t>
+      </w:r>
+    </w:p>
+    <w:p>
+      <w:r>
+        <w:t xml:space="preserve">Uniprot databases queried for search terms </w:t>
+      </w:r>
+      <w:proofErr w:type="spellStart"/>
+      <w:r>
+        <w:t>uvsx</w:t>
+      </w:r>
+      <w:proofErr w:type="spellEnd"/>
+      <w:r>
+        <w:t xml:space="preserve">, </w:t>
+      </w:r>
+      <w:proofErr w:type="spellStart"/>
+      <w:r>
+        <w:t>RecA</w:t>
+      </w:r>
+      <w:proofErr w:type="spellEnd"/>
+      <w:r>
+        <w:t xml:space="preserve">, all </w:t>
+      </w:r>
+      <w:proofErr w:type="spellStart"/>
+      <w:r>
+        <w:t>seqeucnes</w:t>
+      </w:r>
+      <w:proofErr w:type="spellEnd"/>
+      <w:r>
+        <w:t xml:space="preserve"> downloaded along with metadata.</w:t>
+      </w:r>
+    </w:p>
+    <w:p>
+      <w:proofErr w:type="spellStart"/>
+      <w:r>
+        <w:t>PFam</w:t>
+      </w:r>
+      <w:proofErr w:type="spellEnd"/>
+      <w:r>
+        <w:t xml:space="preserve"> domain ids were used to query uniprot and extract all sequences with matches</w:t>
+      </w:r>
+    </w:p>
+    <w:p/>
+    <w:p>
+      <w:pPr>
+        <w:rPr>
+          <w:sz w:val="36"/>
+          <w:szCs w:val="36"/>
+        </w:rPr>
+      </w:pPr>
+      <w:r>
+        <w:rPr>
+          <w:sz w:val="36"/>
+          <w:szCs w:val="36"/>
+        </w:rPr>
+        <w:t xml:space="preserve">Improved </w:t>
+      </w:r>
+      <w:proofErr w:type="spellStart"/>
+      <w:r>
+        <w:rPr>
+          <w:sz w:val="36"/>
+          <w:szCs w:val="36"/>
+        </w:rPr>
+        <w:t>UvsX</w:t>
+      </w:r>
+      <w:proofErr w:type="spellEnd"/>
+      <w:r>
+        <w:rPr>
+          <w:sz w:val="36"/>
+          <w:szCs w:val="36"/>
+        </w:rPr>
+        <w:t xml:space="preserve"> mutants</w:t>
+      </w:r>
+    </w:p>
+    <w:p>
+      <w:r>
+        <w:t xml:space="preserve">From literature recreated </w:t>
+      </w:r>
+      <w:proofErr w:type="spellStart"/>
+      <w:r>
+        <w:t>UvsX</w:t>
+      </w:r>
+      <w:proofErr w:type="spellEnd"/>
+      <w:r>
+        <w:t xml:space="preserve"> mutants that researchers engineered. One paper had base changes another paper had a full loop substitution from a different recombinase</w:t>
+      </w:r>
+    </w:p>
+    <w:p>
+      <w:hyperlink r:id="rId7" w:history="1">
+        <w:r>
+          <w:rPr>
+            <w:rStyle w:val="Hyperlink"/>
+          </w:rPr>
+          <w:t>https://pubs.acs.org/doi/full/10.1021/jacs.4c11893</w:t>
+        </w:r>
+      </w:hyperlink>
+    </w:p>
+    <w:p>
+      <w:hyperlink r:id="rId8" w:history="1">
+        <w:r>
+          <w:rPr>
+            <w:rStyle w:val="Hyperlink"/>
+          </w:rPr>
+          <w:t>https://academic.oup.com/nar/article/54/4/gkag069/8462617?login=true</w:t>
+        </w:r>
+      </w:hyperlink>
+    </w:p>
+    <w:p>
+      <w:hyperlink r:id="rId9" w:history="1">
+        <w:r>
+          <w:rPr>
+            <w:rStyle w:val="Hyperlink"/>
+          </w:rPr>
+          <w:t>https://academic.oup.com/lambio/article/78/6/ovaf081/8154464?login=true</w:t>
+        </w:r>
+      </w:hyperlink>
+    </w:p>
+    <w:p>
+      <w:hyperlink r:id="rId10" w:history="1">
+        <w:r>
+          <w:rPr>
+            <w:rStyle w:val="Hyperlink"/>
+          </w:rPr>
+          <w:t>https://pubs.acs.org/doi/10.1021/acs.biochem.5c00098</w:t>
+        </w:r>
+      </w:hyperlink>
+    </w:p>
+    <w:p/>
     <w:sectPr>
       <w:pgSz w:w="11906" w:h="16838"/>
       <w:pgMar w:top="1440" w:right="1440" w:bottom="1440" w:left="1440" w:header="708" w:footer="708" w:gutter="0"/>
@@ -42,6 +450,126 @@
     </w:sectPr>
   </w:body>
 </w:document>
+</file>
+
+<file path=word/numbering.xml><?xml version="1.0" encoding="utf-8"?>
+<w:numbering xmlns:wpc="http://schemas.microsoft.com/office/word/2010/wordprocessingCanvas" xmlns:cx="http://schemas.microsoft.com/office/drawing/2014/chartex" xmlns:cx1="http://schemas.microsoft.com/office/drawing/2015/9/8/chartex" xmlns:cx2="http://schemas.microsoft.com/office/drawing/2015/10/21/chartex" xmlns:cx3="http://schemas.microsoft.com/office/drawing/2016/5/9/chartex" xmlns:cx4="http://schemas.microsoft.com/office/drawing/2016/5/10/chartex" xmlns:cx5="http://schemas.microsoft.com/office/drawing/2016/5/11/chartex" xmlns:cx6="http://schemas.microsoft.com/office/drawing/2016/5/12/chartex" xmlns:cx7="http://schemas.microsoft.com/office/drawing/2016/5/13/chartex" xmlns:cx8="http://schemas.microsoft.com/office/drawing/2016/5/14/chartex" xmlns:mc="http://schemas.openxmlformats.org/markup-compatibility/2006" xmlns:aink="http://schemas.microsoft.com/office/drawing/2016/ink" xmlns:am3d="http://schemas.microsoft.com/office/drawing/2017/model3d" xmlns:o="urn:schemas-microsoft-com:office:office" xmlns:oel="http://schemas.microsoft.com/office/2019/extlst" xmlns:r="http://schemas.openxmlformats.org/officeDocument/2006/relationships" xmlns:m="http://schemas.openxmlformats.org/officeDocument/2006/math" xmlns:v="urn:schemas-microsoft-com:vml" xmlns:wp14="http://schemas.microsoft.com/office/word/2010/wordprocessingDrawing" xmlns:wp="http://schemas.openxmlformats.org/drawingml/2006/wordprocessingDrawing" xmlns:w10="urn:schemas-microsoft-com:office:word" xmlns:w="http://schemas.openxmlformats.org/wordprocessingml/2006/main" xmlns:w14="http://schemas.microsoft.com/office/word/2010/wordml" xmlns:w15="http://schemas.microsoft.com/office/word/2012/wordml" xmlns:w16cex="http://schemas.microsoft.com/office/word/2018/wordml/cex" xmlns:w16cid="http://schemas.microsoft.com/office/word/2016/wordml/cid" xmlns:w16="http://schemas.microsoft.com/office/word/2018/wordml" xmlns:w16du="http://schemas.microsoft.com/office/word/2023/wordml/word16du" xmlns:w16sdtdh="http://schemas.microsoft.com/office/word/2020/wordml/sdtdatahash" xmlns:w16sdtfl="http://schemas.microsoft.com/office/word/2024/wordml/sdtformatlock" xmlns:w16se="http://schemas.microsoft.com/office/word/2015/wordml/symex" xmlns:wpg="http://schemas.microsoft.com/office/word/2010/wordprocessingGroup" xmlns:wpi="http://schemas.microsoft.com/office/word/2010/wordprocessingInk" xmlns:wne="http://schemas.microsoft.com/office/word/2006/wordml" xmlns:wps="http://schemas.microsoft.com/office/word/2010/wordprocessingShape" mc:Ignorable="w14 w15 w16se w16cid w16 w16cex w16sdtdh w16sdtfl w16du wp14">
+  <w:abstractNum w:abstractNumId="0" w15:restartNumberingAfterBreak="0">
+    <w:nsid w:val="1E8339AD"/>
+    <w:multiLevelType w:val="hybridMultilevel"/>
+    <w:tmpl w:val="07CC8DAA"/>
+    <w:lvl w:ilvl="0" w:tplc="0B761578">
+      <w:numFmt w:val="bullet"/>
+      <w:lvlText w:val="-"/>
+      <w:lvlJc w:val="left"/>
+      <w:pPr>
+        <w:ind w:left="720" w:hanging="360"/>
+      </w:pPr>
+      <w:rPr>
+        <w:rFonts w:ascii="Aptos" w:eastAsiaTheme="minorHAnsi" w:hAnsi="Aptos" w:cstheme="minorBidi" w:hint="default"/>
+      </w:rPr>
+    </w:lvl>
+    <w:lvl w:ilvl="1" w:tplc="08090003" w:tentative="1">
+      <w:start w:val="1"/>
+      <w:numFmt w:val="bullet"/>
+      <w:lvlText w:val="o"/>
+      <w:lvlJc w:val="left"/>
+      <w:pPr>
+        <w:ind w:left="1440" w:hanging="360"/>
+      </w:pPr>
+      <w:rPr>
+        <w:rFonts w:ascii="Courier New" w:hAnsi="Courier New" w:cs="Courier New" w:hint="default"/>
+      </w:rPr>
+    </w:lvl>
+    <w:lvl w:ilvl="2" w:tplc="08090005" w:tentative="1">
+      <w:start w:val="1"/>
+      <w:numFmt w:val="bullet"/>
+      <w:lvlText w:val=""/>
+      <w:lvlJc w:val="left"/>
+      <w:pPr>
+        <w:ind w:left="2160" w:hanging="360"/>
+      </w:pPr>
+      <w:rPr>
+        <w:rFonts w:ascii="Wingdings" w:hAnsi="Wingdings" w:hint="default"/>
+      </w:rPr>
+    </w:lvl>
+    <w:lvl w:ilvl="3" w:tplc="08090001" w:tentative="1">
+      <w:start w:val="1"/>
+      <w:numFmt w:val="bullet"/>
+      <w:lvlText w:val=""/>
+      <w:lvlJc w:val="left"/>
+      <w:pPr>
+        <w:ind w:left="2880" w:hanging="360"/>
+      </w:pPr>
+      <w:rPr>
+        <w:rFonts w:ascii="Symbol" w:hAnsi="Symbol" w:hint="default"/>
+      </w:rPr>
+    </w:lvl>
+    <w:lvl w:ilvl="4" w:tplc="08090003" w:tentative="1">
+      <w:start w:val="1"/>
+      <w:numFmt w:val="bullet"/>
+      <w:lvlText w:val="o"/>
+      <w:lvlJc w:val="left"/>
+      <w:pPr>
+        <w:ind w:left="3600" w:hanging="360"/>
+      </w:pPr>
+      <w:rPr>
+        <w:rFonts w:ascii="Courier New" w:hAnsi="Courier New" w:cs="Courier New" w:hint="default"/>
+      </w:rPr>
+    </w:lvl>
+    <w:lvl w:ilvl="5" w:tplc="08090005" w:tentative="1">
+      <w:start w:val="1"/>
+      <w:numFmt w:val="bullet"/>
+      <w:lvlText w:val=""/>
+      <w:lvlJc w:val="left"/>
+      <w:pPr>
+        <w:ind w:left="4320" w:hanging="360"/>
+      </w:pPr>
+      <w:rPr>
+        <w:rFonts w:ascii="Wingdings" w:hAnsi="Wingdings" w:hint="default"/>
+      </w:rPr>
+    </w:lvl>
+    <w:lvl w:ilvl="6" w:tplc="08090001" w:tentative="1">
+      <w:start w:val="1"/>
+      <w:numFmt w:val="bullet"/>
+      <w:lvlText w:val=""/>
+      <w:lvlJc w:val="left"/>
+      <w:pPr>
+        <w:ind w:left="5040" w:hanging="360"/>
+      </w:pPr>
+      <w:rPr>
+        <w:rFonts w:ascii="Symbol" w:hAnsi="Symbol" w:hint="default"/>
+      </w:rPr>
+    </w:lvl>
+    <w:lvl w:ilvl="7" w:tplc="08090003" w:tentative="1">
+      <w:start w:val="1"/>
+      <w:numFmt w:val="bullet"/>
+      <w:lvlText w:val="o"/>
+      <w:lvlJc w:val="left"/>
+      <w:pPr>
+        <w:ind w:left="5760" w:hanging="360"/>
+      </w:pPr>
+      <w:rPr>
+        <w:rFonts w:ascii="Courier New" w:hAnsi="Courier New" w:cs="Courier New" w:hint="default"/>
+      </w:rPr>
+    </w:lvl>
+    <w:lvl w:ilvl="8" w:tplc="08090005" w:tentative="1">
+      <w:start w:val="1"/>
+      <w:numFmt w:val="bullet"/>
+      <w:lvlText w:val=""/>
+      <w:lvlJc w:val="left"/>
+      <w:pPr>
+        <w:ind w:left="6480" w:hanging="360"/>
+      </w:pPr>
+      <w:rPr>
+        <w:rFonts w:ascii="Wingdings" w:hAnsi="Wingdings" w:hint="default"/>
+      </w:rPr>
+    </w:lvl>
+  </w:abstractNum>
+  <w:num w:numId="1" w16cid:durableId="627206591">
+    <w:abstractNumId w:val="0"/>
+  </w:num>
+</w:numbering>
 </file>
 
 <file path=word/styles.xml><?xml version="1.0" encoding="utf-8"?>
@@ -961,6 +1489,29 @@
       <w:spacing w:val="5"/>
     </w:rPr>
   </w:style>
+  <w:style w:type="character" w:styleId="Hyperlink">
+    <w:name w:val="Hyperlink"/>
+    <w:basedOn w:val="DefaultParagraphFont"/>
+    <w:uiPriority w:val="99"/>
+    <w:unhideWhenUsed/>
+    <w:rsid w:val="00360605"/>
+    <w:rPr>
+      <w:color w:val="467886" w:themeColor="hyperlink"/>
+      <w:u w:val="single"/>
+    </w:rPr>
+  </w:style>
+  <w:style w:type="character" w:styleId="UnresolvedMention">
+    <w:name w:val="Unresolved Mention"/>
+    <w:basedOn w:val="DefaultParagraphFont"/>
+    <w:uiPriority w:val="99"/>
+    <w:semiHidden/>
+    <w:unhideWhenUsed/>
+    <w:rsid w:val="00360605"/>
+    <w:rPr>
+      <w:color w:val="605E5C"/>
+      <w:shd w:val="clear" w:color="auto" w:fill="E1DFDD"/>
+    </w:rPr>
+  </w:style>
 </w:styles>
 </file>
 

</xml_diff>